<commit_message>
feat: update AppSheet form document with Gemini mentor link
</commit_message>
<xml_diff>
--- a/Formulario_AppSheet.docx
+++ b/Formulario_AppSheet.docx
@@ -62,11 +62,15 @@
         <w:jc w:val="center"/>
       </w:pPr>
       <w:r>
-        <w:rPr>
-          <w:color w:val="595959"/>
-          <w:sz w:val="18"/>
-        </w:rPr>
         <w:t>https://forms.gle/jXF6f367cq3p13f67</w:t>
+        <w:br/>
+        <w:br/>
+        <w:t>---</w:t>
+        <w:br/>
+        <w:br/>
+        <w:t>Gemini — Mentor do Aplicativo de Despesas</w:t>
+        <w:br/>
+        <w:t>https://gemini.google.com/gem/1wkNkLW_g8akTrsv_tJs0DF0LH2S0DAI3?usp=sharing</w:t>
       </w:r>
     </w:p>
     <w:sectPr>

</xml_diff>